<commit_message>
v11.0 : CGV v1.2 (frais de résiliation anticipée, clause fermeture, rétractation précisée), contrat apporteur v1.4 (prime bloquée 14 j, garde dans les relevés), contrat secrétaire v1.1 (préavis de fin d'affectation), tuto email SMTP toutes boîtes + modèles papier du pack mis à jour
</commit_message>
<xml_diff>
--- a/docs/pack-commercial/ENTRETIEN-COLLABORATION_secretaire.docx
+++ b/docs/pack-commercial/ENTRETIEN-COLLABORATION_secretaire.docx
@@ -388,6 +388,25 @@
           <w:sz w:val="21"/>
         </w:rPr>
         <w:t>les garages vous sont affectés d'un commun accord et par écrit (annexe 1 du contrat, tenue à jour sur votre fiche). Vous pouvez refuser une affectation. Le volume indicatif = les heures du forfait de chaque garage (10, 20 ou 40 h par mois).</w:t>
+      </w:r>
+    </w:p>
+    <w:p>
+      <w:pPr>
+        <w:pStyle w:val="ListBullet"/>
+        <w:spacing w:after="40"/>
+      </w:pPr>
+      <w:r>
+        <w:rPr>
+          <w:b/>
+          <w:sz w:val="21"/>
+        </w:rPr>
+        <w:t xml:space="preserve">Fin d'affectation : </w:t>
+      </w:r>
+      <w:r>
+        <w:rPr>
+          <w:sz w:val="21"/>
+        </w:rPr>
+        <w:t>si un garage résilie, change de formule ou ferme, vous êtes prévenue dès que c'est connu, avec un préavis d'au moins 15 jours avant la fin effective de l'affectation (sauf arrêt immédiat imposé, impayé ou rétractation) ; votre rémunération reste due sur chaque mensualité encaissée jusque-là. Perdre une affectation ne met pas fin au contrat.</w:t>
       </w:r>
     </w:p>
     <w:p>

</xml_diff>

<commit_message>
Pack documentaire v1.4 - guide revenus corrige (chomage, provision, CAF, France Travail), plaquette tarifaire refaite, 6 documents alignes sur CGV v2.0 et contrat v2.1
</commit_message>
<xml_diff>
--- a/docs/pack-commercial/ENTRETIEN-COLLABORATION_secretaire.docx
+++ b/docs/pack-commercial/ENTRETIEN-COLLABORATION_secretaire.docx
@@ -476,13 +476,7 @@
           <w:b/>
           <w:sz w:val="21"/>
         </w:rPr>
-        <w:t xml:space="preserve">Durée : </w:t>
-      </w:r>
-      <w:r>
-        <w:rPr>
-          <w:sz w:val="21"/>
-        </w:rPr>
-        <w:t>durée indéterminée, préavis d'un mois de part et d'autre, période d'essai de 2 mois (préavis 7 jours) ; non-sollicitation réciproque 12 mois.</w:t>
+        <w:t xml:space="preserve">Durée : durée indéterminée, préavis d'un mois de part et d'autre (contrat de prestation v2.1) ; pas de période d'essai — c'est une notion salariale, étrangère à une prestation indépendante ; non-sollicitation et non-contournement 12 mois.</w:t>
       </w:r>
     </w:p>
     <w:p>

</xml_diff>